<commit_message>
Correct scholarship and add planar certificate
</commit_message>
<xml_diff>
--- a/paper/article.docx
+++ b/paper/article.docx
@@ -11,30 +11,20 @@
           <w:b/>
           <w:bCs/>
         </w:rPr>
-        <w:t xml:space="preserve">From Rybin’s Triangle Counterexample to Universal</w:t>
+        <w:t xml:space="preserve">Independence-System Realisations in Single-Source Unsplittable Flow</w:t>
+      </w:r>
+    </w:p>
+    <w:p>
+      <w:pPr>
+        <w:pStyle w:val="Author"/>
+      </w:pPr>
+      <w:r>
+        <w:t xml:space="preserve">Koyar Afrasyab</w:t>
       </w:r>
       <w:r>
         <w:br/>
       </w:r>
-      <w:r>
-        <w:rPr>
-          <w:b/>
-          <w:bCs/>
-        </w:rPr>
-        <w:t xml:space="preserve">Independence-System Realisations in Unsplittable Flow</w:t>
-      </w:r>
-    </w:p>
-    <w:p>
-      <w:pPr>
-        <w:pStyle w:val="Author"/>
-      </w:pPr>
-      <w:r>
-        <w:t xml:space="preserve">Koyar Afrasyab</w:t>
-      </w:r>
-      <w:r>
-        <w:br/>
-      </w:r>
-      <w:hyperlink r:id="rId121">
+      <w:hyperlink r:id="rId9">
         <w:r>
           <w:rPr>
             <w:rStyle w:val="Hyperlink"/>
@@ -64,7 +54,7 @@
         <w:pStyle w:val="Abstract"/>
       </w:pPr>
       <w:r>
-        <w:t xml:space="preserve">Rybin’s recently announced seven-vertex counterexample to Goemans’ cost-preserving single-source unsplittable-flow conjecture uses additive-congestion constraints to make three zero-cost detours behave as the stable sets of a triangle. This note isolates and generalises that mechanism. We introduce a path-closed notion of realising an independence system by the zero-cost choices of primary terminals in a directed acyclic flow instance. The definition quantifies over every directed source–terminal path and therefore remains valid under prefix borrowing, suffix splicing, and hybrid routes.</w:t>
+        <w:t xml:space="preserve">Additive-congestion constraints in single-source unsplittable flow can enforce stable-set structure. This note isolates and generalises that mechanism. We introduce a path-closed notion of realising an independence system by the zero-cost choices of primary terminals in a directed acyclic flow instance. The definition quantifies over every directed source–terminal path and therefore remains valid under prefix borrowing, suffix splicing, and hybrid routes.</w:t>
       </w:r>
     </w:p>
     <w:p>
@@ -300,7 +290,7 @@
         <w:t xml:space="preserve">unsplittable routings using rational arithmetic.</w:t>
       </w:r>
     </w:p>
-    <w:bookmarkStart w:id="124" w:name="introduction"/>
+    <w:bookmarkStart w:id="12" w:name="introduction"/>
     <w:p>
       <w:pPr>
         <w:pStyle w:val="Heading1"/>
@@ -399,7 +389,7 @@
         </m:r>
       </m:oMath>
       <w:r>
-        <w:t xml:space="preserve">. The machine-readable copy in this repository is a reproduction of that instance, not an original construction of this article. Our independent exact verifier derives all six source–terminal paths from the arc list and checks all eight routings. The announcement is not a conventional peer-reviewed publication, but the finite certificate directly refutes the cost-preserving statement as formulated.</w:t>
+        <w:t xml:space="preserve">. The machine-readable copy in this repository is a reproduction of that instance, not an original construction of this article. Our independent exact verifier derives all six source–terminal paths from the arc list and checks all eight routings. Thus the refutation used here follows from the reproduced finite certificate and its independent exact audit, not from the authority or eventual status of the announcement.</w:t>
       </w:r>
     </w:p>
     <w:p>
@@ -407,7 +397,7 @@
         <w:pStyle w:val="BodyText"/>
       </w:pPr>
       <w:r>
-        <w:t xml:space="preserve">This article takes Rybin’s triangle mechanism as its starting point and asks a structural question: which discrete choice systems can be encoded by the additive-congestion inequalities of a single-source instance? A primary terminal is interpreted as</w:t>
+        <w:t xml:space="preserve">The certificate exhibits a triangle conflict mechanism and motivates a structural question: which discrete choice systems can be encoded by the additive-congestion inequalities of a single-source instance? A primary terminal is interpreted as</w:t>
       </w:r>
       <w:r>
         <w:t xml:space="preserve"> </w:t>
@@ -422,7 +412,7 @@
         <w:t xml:space="preserve">when it uses its unique zero-cost path. Auxiliary terminals enforce incompatibilities through ordinary shared arc loads. The central difficulty is path closure: a valid construction cannot prescribe a short menu of routes and ignore other paths that the graph itself creates. Any source prefix may combine with any reachable suffix, so a sound proof must survive all borrowed and hybrid routes.</w:t>
       </w:r>
     </w:p>
-    <w:bookmarkStart w:id="122" w:name="contributions"/>
+    <w:bookmarkStart w:id="10" w:name="contributions"/>
     <w:p>
       <w:pPr>
         <w:pStyle w:val="Heading2"/>
@@ -437,17 +427,6 @@
       </w:pPr>
       <w:r>
         <w:t xml:space="preserve">The main contributions are as follows.</w:t>
-      </w:r>
-    </w:p>
-    <w:p>
-      <w:pPr>
-        <w:numPr>
-          <w:ilvl w:val="0"/>
-          <w:numId w:val="1001"/>
-        </w:numPr>
-      </w:pPr>
-      <w:r>
-        <w:t xml:space="preserve">We independently certify Rybin’s triangle counterexample from its arc list and record its provenance explicitly.</w:t>
       </w:r>
     </w:p>
     <w:p>
@@ -482,7 +461,7 @@
         </w:numPr>
       </w:pPr>
       <w:r>
-        <w:t xml:space="preserve">We generalise the triangle mechanism with an explicit acyclic construction that strongly realises every finite loopless independence system. Its size is linear in the ground-set size plus the total incidence size of the minimal forbidden sets.</w:t>
+        <w:t xml:space="preserve">We give an explicit acyclic construction that strongly realises every finite loopless independence system. Its size is linear in the ground-set size plus the total incidence size of the minimal forbidden sets.</w:t>
       </w:r>
     </w:p>
     <w:p>
@@ -515,7 +494,7 @@
         </w:numPr>
       </w:pPr>
       <w:r>
-        <w:t xml:space="preserve">We supply an exact</w:t>
+        <w:t xml:space="preserve">We independently certify the provenance-labelled triangle instance and supply an exact</w:t>
       </w:r>
       <w:r>
         <w:t xml:space="preserve"> </w:t>
@@ -538,11 +517,11 @@
         <w:t xml:space="preserve"> </w:t>
       </w:r>
       <w:r>
-        <w:t xml:space="preserve">certificate and an all-path, all-routing verifier based solely on rational arithmetic.</w:t>
-      </w:r>
-    </w:p>
-    <w:bookmarkEnd w:id="122"/>
-    <w:bookmarkStart w:id="123" w:name="scope"/>
+        <w:t xml:space="preserve">certificate, using all-path, all-routing verifiers based solely on rational arithmetic.</w:t>
+      </w:r>
+    </w:p>
+    <w:bookmarkEnd w:id="10"/>
+    <w:bookmarkStart w:id="11" w:name="scope"/>
     <w:p>
       <w:pPr>
         <w:pStyle w:val="Heading2"/>
@@ -632,9 +611,9 @@
         <w:t xml:space="preserve">nor rules out stronger unrelated gadgets. The universal construction is elementary and closely related to standard conflict-encoding ideas. We therefore present this work as a research note and do not claim broad priority for the general mechanism absent a comprehensive expert literature review.</w:t>
       </w:r>
     </w:p>
-    <w:bookmarkEnd w:id="123"/>
-    <w:bookmarkEnd w:id="124"/>
-    <w:bookmarkStart w:id="125" w:name="related-work"/>
+    <w:bookmarkEnd w:id="11"/>
+    <w:bookmarkEnd w:id="12"/>
+    <w:bookmarkStart w:id="13" w:name="related-work"/>
     <w:p>
       <w:pPr>
         <w:pStyle w:val="Heading1"/>
@@ -666,7 +645,58 @@
         <w:t xml:space="preserve">(Morell and Skutella 2022)</w:t>
       </w:r>
       <w:r>
-        <w:t xml:space="preserve">. Traub, Vargas Koch, and Zenklusen obtained results for planar and bounded-genus graphs</w:t>
+        <w:t xml:space="preserve">. Majthoub Almoghrabi, Skutella, and Warode proved strong decomposition results for series-parallel digraphs</w:t>
+      </w:r>
+      <w:r>
+        <w:t xml:space="preserve"> </w:t>
+      </w:r>
+      <w:r>
+        <w:t xml:space="preserve">(Majthoub Almoghrabi et al. 2025)</w:t>
+      </w:r>
+      <w:r>
+        <w:t xml:space="preserve">. Swamy, Traub, Vargas Koch, and Zenklusen showed how an unweighted error-bounded variant implies a relaxed cost guarantee</w:t>
+      </w:r>
+      <w:r>
+        <w:t xml:space="preserve"> </w:t>
+      </w:r>
+      <w:r>
+        <w:t xml:space="preserve">(Swamy et al. 2026)</w:t>
+      </w:r>
+      <w:r>
+        <w:t xml:space="preserve">.</w:t>
+      </w:r>
+    </w:p>
+    <w:p>
+      <w:pPr>
+        <w:pStyle w:val="BodyText"/>
+      </w:pPr>
+      <w:r>
+        <w:t xml:space="preserve">Traub, Vargas Koch, and Zenklusen proved that planar acyclic instances admit the simultaneous upper and lower additive-</w:t>
+      </w:r>
+      <m:oMath>
+        <m:r>
+          <m:t>D</m:t>
+        </m:r>
+      </m:oMath>
+      <w:r>
+        <w:t xml:space="preserve"> </w:t>
+      </w:r>
+      <w:r>
+        <w:t xml:space="preserve">bounds without costs, and the cost-preserving conclusion with additive-</w:t>
+      </w:r>
+      <m:oMath>
+        <m:r>
+          <m:t>2</m:t>
+        </m:r>
+        <m:r>
+          <m:t>D</m:t>
+        </m:r>
+      </m:oMath>
+      <w:r>
+        <w:t xml:space="preserve"> </w:t>
+      </w:r>
+      <w:r>
+        <w:t xml:space="preserve">bounds</w:t>
       </w:r>
       <w:r>
         <w:t xml:space="preserve"> </w:t>
@@ -675,25 +705,66 @@
         <w:t xml:space="preserve">(Traub et al. 2026)</w:t>
       </w:r>
       <w:r>
-        <w:t xml:space="preserve">. Almoghrabi, Skutella, and Warode proved strong decomposition results for series-parallel digraphs</w:t>
-      </w:r>
-      <w:r>
-        <w:t xml:space="preserve"> </w:t>
-      </w:r>
-      <w:r>
-        <w:t xml:space="preserve">(Majthoub Almoghrabi et al. 2024)</w:t>
-      </w:r>
-      <w:r>
-        <w:t xml:space="preserve">. Swamy, Traub, Vargas Koch, and Zenklusen showed how an unweighted error-bounded variant implies a relaxed cost guarantee</w:t>
-      </w:r>
-      <w:r>
-        <w:t xml:space="preserve"> </w:t>
-      </w:r>
-      <w:r>
-        <w:t xml:space="preserve">(Swamy et al. 2026)</w:t>
-      </w:r>
-      <w:r>
-        <w:t xml:space="preserve">. These works predate Rybin’s July 2026 announcement and naturally describe the cost-preserving statement as a conjecture; they should not be read as evidence of its status after the counterexample appeared.</w:t>
+        <w:t xml:space="preserve">. The reproduced seven-vertex graph is itself planar: its underlying undirected graph suppresses to</w:t>
+      </w:r>
+      <w:r>
+        <w:t xml:space="preserve"> </w:t>
+      </w:r>
+      <m:oMath>
+        <m:sSub>
+          <m:e>
+            <m:r>
+              <m:t>K</m:t>
+            </m:r>
+          </m:e>
+          <m:sub>
+            <m:r>
+              <m:t>4</m:t>
+            </m:r>
+          </m:sub>
+        </m:sSub>
+      </m:oMath>
+      <w:r>
+        <w:t xml:space="preserve"> </w:t>
+      </w:r>
+      <w:r>
+        <w:t xml:space="preserve">after the three degree-two terminals are removed. The exact checker verifies this subdivision certificate. Consequently, the audited instance rules out the cost-preserving additive-</w:t>
+      </w:r>
+      <m:oMath>
+        <m:r>
+          <m:t>D</m:t>
+        </m:r>
+      </m:oMath>
+      <w:r>
+        <w:t xml:space="preserve"> </w:t>
+      </w:r>
+      <w:r>
+        <w:t xml:space="preserve">statement even for planar acyclic graphs, but it does not contradict either the cost-free additive-</w:t>
+      </w:r>
+      <m:oMath>
+        <m:r>
+          <m:t>D</m:t>
+        </m:r>
+      </m:oMath>
+      <w:r>
+        <w:t xml:space="preserve"> </w:t>
+      </w:r>
+      <w:r>
+        <w:t xml:space="preserve">theorem or the cost-preserving additive-</w:t>
+      </w:r>
+      <m:oMath>
+        <m:r>
+          <m:t>2</m:t>
+        </m:r>
+        <m:r>
+          <m:t>D</m:t>
+        </m:r>
+      </m:oMath>
+      <w:r>
+        <w:t xml:space="preserve"> </w:t>
+      </w:r>
+      <w:r>
+        <w:t xml:space="preserve">theorem.</w:t>
       </w:r>
     </w:p>
     <w:p>
@@ -701,7 +772,7 @@
         <w:pStyle w:val="BodyText"/>
       </w:pPr>
       <w:r>
-        <w:t xml:space="preserve">Rybin’s counterexample is the immediate antecedent of this note</w:t>
+        <w:t xml:space="preserve">The publicly announced triangle instance is the immediate antecedent of this note</w:t>
       </w:r>
       <w:r>
         <w:t xml:space="preserve"> </w:t>
@@ -721,7 +792,7 @@
         <w:t xml:space="preserve"> </w:t>
       </w:r>
       <w:r>
-        <w:t xml:space="preserve">bounds. Our construction replaces the nested triangle spine with one incidence resource per element–forbidden-set pair and one auxiliary demand per minimal forbidden set. In this precise sense, the universal theorem is a generalisation of the publicly announced triangle mechanism.</w:t>
+        <w:t xml:space="preserve">bounds. Our construction replaces the nested triangle spine with one incidence resource per element–forbidden-set pair and one auxiliary demand per minimal forbidden set. This attribution identifies the methodological seed; the results below concern the resulting general construction and its certificates.</w:t>
       </w:r>
     </w:p>
     <w:p>
@@ -750,8 +821,8 @@
         <w:t xml:space="preserve">. Here the forbidden system is induced internally by fractional baseline loads, auxiliary demands, and additive arc inequalities. Encoding conflicts with shared capacities is a familiar modelling pattern, so the contribution claimed here is limited to the stated path-closed construction, proof, threshold calculation, and exact certificates. A targeted search found no directly equivalent theorem, but that search is not an exhaustive priority determination.</w:t>
       </w:r>
     </w:p>
-    <w:bookmarkEnd w:id="125"/>
-    <w:bookmarkStart w:id="126" w:name="sec:model"/>
+    <w:bookmarkEnd w:id="13"/>
+    <w:bookmarkStart w:id="14" w:name="sec:model"/>
     <w:p>
       <w:pPr>
         <w:pStyle w:val="Heading1"/>
@@ -1942,8 +2013,8 @@
         </m:oMath>
       </m:oMathPara>
     </w:p>
-    <w:bookmarkEnd w:id="126"/>
-    <w:bookmarkStart w:id="133" w:name="sec:universal"/>
+    <w:bookmarkEnd w:id="14"/>
+    <w:bookmarkStart w:id="21" w:name="sec:universal"/>
     <w:p>
       <w:pPr>
         <w:pStyle w:val="Heading1"/>
@@ -1960,7 +2031,7 @@
         <w:t xml:space="preserve">We now give the construction in explicit vertex-and-arc form. This makes the acyclicity, path closure, and fractional feasibility transparent.</w:t>
       </w:r>
     </w:p>
-    <w:bookmarkStart w:id="127" w:name="construction"/>
+    <w:bookmarkStart w:id="15" w:name="construction"/>
     <w:p>
       <w:pPr>
         <w:pStyle w:val="Heading2"/>
@@ -3054,8 +3125,8 @@
         <w:t xml:space="preserve">first, order the private chain vertices from left to right, and place all primary and auxiliary terminals last.</w:t>
       </w:r>
     </w:p>
-    <w:bookmarkEnd w:id="127"/>
-    <w:bookmarkStart w:id="132" w:name="fractional-flow"/>
+    <w:bookmarkEnd w:id="15"/>
+    <w:bookmarkStart w:id="20" w:name="fractional-flow"/>
     <w:p>
       <w:pPr>
         <w:pStyle w:val="Heading2"/>
@@ -3450,7 +3521,7 @@
         <w:t xml:space="preserve">All other loads follow directly from the described path flow, so flow conservation holds at every vertex.</w:t>
       </w:r>
     </w:p>
-    <w:bookmarkStart w:id="128" w:name="lem:dominator"/>
+    <w:bookmarkStart w:id="16" w:name="lem:dominator"/>
     <w:p>
       <w:pPr>
         <w:pStyle w:val="BodyText"/>
@@ -3573,7 +3644,7 @@
         <w:t xml:space="preserve">immediately before its final exit.</w:t>
       </w:r>
     </w:p>
-    <w:bookmarkEnd w:id="128"/>
+    <w:bookmarkEnd w:id="16"/>
     <w:p>
       <w:pPr>
         <w:pStyle w:val="BodyText"/>
@@ -3847,7 +3918,7 @@
         <w:t xml:space="preserve">. A borrowed prefix may add earlier resources but cannot bypass this last one. ◻</w:t>
       </w:r>
     </w:p>
-    <w:bookmarkStart w:id="129" w:name="lem:unique"/>
+    <w:bookmarkStart w:id="17" w:name="lem:unique"/>
     <w:p>
       <w:pPr>
         <w:pStyle w:val="BodyText"/>
@@ -3907,7 +3978,7 @@
         <w:t xml:space="preserve">, its full private chain is its unique zero-cost path.</w:t>
       </w:r>
     </w:p>
-    <w:bookmarkEnd w:id="129"/>
+    <w:bookmarkEnd w:id="17"/>
     <w:p>
       <w:pPr>
         <w:pStyle w:val="BodyText"/>
@@ -3957,7 +4028,7 @@
         <w:t xml:space="preserve">path is the full chain, whose arcs all have zero cost. ◻</w:t>
       </w:r>
     </w:p>
-    <w:bookmarkStart w:id="130" w:name="thm:universal"/>
+    <w:bookmarkStart w:id="18" w:name="thm:universal"/>
     <w:p>
       <w:pPr>
         <w:pStyle w:val="BodyText"/>
@@ -4094,7 +4165,7 @@
         </m:oMath>
       </m:oMathPara>
     </w:p>
-    <w:bookmarkEnd w:id="130"/>
+    <w:bookmarkEnd w:id="18"/>
     <w:p>
       <w:pPr>
         <w:pStyle w:val="FirstParagraph"/>
@@ -4804,7 +4875,7 @@
         <w:t xml:space="preserve">There are two private vertices and a constant number of arcs per incidence, plus one terminal and a constant number of arcs per ground element or forbidden set, giving the stated size bound. ◻</w:t>
       </w:r>
     </w:p>
-    <w:bookmarkStart w:id="131" w:name="cor:graphs"/>
+    <w:bookmarkStart w:id="19" w:name="cor:graphs"/>
     <w:p>
       <w:pPr>
         <w:pStyle w:val="BodyText"/>
@@ -4833,7 +4904,7 @@
         <w:t xml:space="preserve">Every finite simple graph is strongly realisable by taking its edges as the minimal forbidden sets. More generally, every finite hypergraph independence system with no singleton forbidden hyperedge is strongly realisable.</w:t>
       </w:r>
     </w:p>
-    <w:bookmarkEnd w:id="131"/>
+    <w:bookmarkEnd w:id="19"/>
     <w:p>
       <w:pPr>
         <w:pStyle w:val="BodyText"/>
@@ -4842,9 +4913,9 @@
         <w:t xml:space="preserve">This includes complete graphs, odd holes, odd antiholes, webs, antiwebs, and minimally imperfect graphs. The point is not that these graph classes share a path-intersection representation, but that their stable sets can be encoded by ordinary load inequalities in a single-source flow instance.</w:t>
       </w:r>
     </w:p>
-    <w:bookmarkEnd w:id="132"/>
-    <w:bookmarkEnd w:id="133"/>
-    <w:bookmarkStart w:id="135" w:name="sec:cycle"/>
+    <w:bookmarkEnd w:id="20"/>
+    <w:bookmarkEnd w:id="21"/>
+    <w:bookmarkStart w:id="23" w:name="sec:cycle"/>
     <w:p>
       <w:pPr>
         <w:pStyle w:val="Heading1"/>
@@ -5602,7 +5673,7 @@
         <w:t xml:space="preserve">.</w:t>
       </w:r>
     </w:p>
-    <w:bookmarkStart w:id="134" w:name="thm:cycle"/>
+    <w:bookmarkStart w:id="22" w:name="thm:cycle"/>
     <w:p>
       <w:pPr>
         <w:pStyle w:val="BodyText"/>
@@ -5681,7 +5752,7 @@
         <w:t xml:space="preserve">.</w:t>
       </w:r>
     </w:p>
-    <w:bookmarkEnd w:id="134"/>
+    <w:bookmarkEnd w:id="22"/>
     <w:p>
       <w:pPr>
         <w:pStyle w:val="BodyText"/>
@@ -6263,8 +6334,8 @@
         </m:oMath>
       </m:oMathPara>
     </w:p>
-    <w:bookmarkEnd w:id="135"/>
-    <w:bookmarkStart w:id="137" w:name="sec:threshold"/>
+    <w:bookmarkEnd w:id="23"/>
+    <w:bookmarkStart w:id="25" w:name="sec:threshold"/>
     <w:p>
       <w:pPr>
         <w:pStyle w:val="Heading1"/>
@@ -6847,7 +6918,7 @@
         </m:oMath>
       </m:oMathPara>
     </w:p>
-    <w:bookmarkStart w:id="136" w:name="thm:threshold"/>
+    <w:bookmarkStart w:id="24" w:name="thm:threshold"/>
     <w:p>
       <w:pPr>
         <w:pStyle w:val="FirstParagraph"/>
@@ -7250,7 +7321,7 @@
         <w:t xml:space="preserve">.</w:t>
       </w:r>
     </w:p>
-    <w:bookmarkEnd w:id="136"/>
+    <w:bookmarkEnd w:id="24"/>
     <w:p>
       <w:pPr>
         <w:pStyle w:val="FirstParagraph"/>
@@ -8205,8 +8276,8 @@
         <w:t xml:space="preserve">. ◻</w:t>
       </w:r>
     </w:p>
-    <w:bookmarkEnd w:id="137"/>
-    <w:bookmarkStart w:id="138" w:name="sec:optimisation"/>
+    <w:bookmarkEnd w:id="25"/>
+    <w:bookmarkStart w:id="26" w:name="sec:optimisation"/>
     <w:p>
       <w:pPr>
         <w:pStyle w:val="Heading1"/>
@@ -8977,8 +9048,8 @@
         </m:oMath>
       </m:oMathPara>
     </w:p>
-    <w:bookmarkEnd w:id="138"/>
-    <w:bookmarkStart w:id="144" w:name="sec:c5"/>
+    <w:bookmarkEnd w:id="26"/>
+    <w:bookmarkStart w:id="32" w:name="sec:c5"/>
     <w:p>
       <w:pPr>
         <w:pStyle w:val="Heading1"/>
@@ -9081,7 +9152,7 @@
         <w:t xml:space="preserve">records the resulting parameters.</w:t>
       </w:r>
     </w:p>
-    <w:bookmarkStart w:id="139" w:name="tab:c5"/>
+    <w:bookmarkStart w:id="27" w:name="tab:c5"/>
     <w:p>
       <w:pPr>
         <w:pStyle w:val="TableCaption"/>
@@ -9460,7 +9531,7 @@
         </w:tc>
       </w:tr>
     </w:tbl>
-    <w:bookmarkEnd w:id="139"/>
+    <w:bookmarkEnd w:id="27"/>
     <w:p>
       <w:pPr>
         <w:pStyle w:val="BodyText"/>
@@ -9547,7 +9618,7 @@
         <w:t xml:space="preserve">unsplittable routings. It derives the path sets from the arc list and does not trust a prescribed decomposition.</w:t>
       </w:r>
     </w:p>
-    <w:bookmarkStart w:id="143" w:name="fig:c5"/>
+    <w:bookmarkStart w:id="31" w:name="fig:c5"/>
     <w:p>
       <w:pPr>
         <w:pStyle w:val="CaptionedFigure"/>
@@ -9555,20 +9626,20 @@
       <w:r>
         <w:drawing>
           <wp:inline>
-            <wp:extent cx="4279392" cy="6151258"/>
+            <wp:extent cx="3840480" cy="5520359"/>
             <wp:effectExtent b="0" l="0" r="0" t="0"/>
-            <wp:docPr descr="Directed acyclic C5 flow gadget with five primary chains and five auxiliary terminals." title="" id="141" name="Picture"/>
+            <wp:docPr descr="Directed acyclic C5 flow gadget with five primary chains and five auxiliary terminals." title="" id="29" name="Picture"/>
             <a:graphic>
               <a:graphicData uri="http://schemas.openxmlformats.org/drawingml/2006/picture">
                 <pic:pic>
                   <pic:nvPicPr>
-                    <pic:cNvPr descr="figures/c5.png" id="142" name="Picture"/>
+                    <pic:cNvPr descr="figures/c5.png" id="30" name="Picture"/>
                     <pic:cNvPicPr>
                       <a:picLocks noChangeArrowheads="1" noChangeAspect="1"/>
                     </pic:cNvPicPr>
                   </pic:nvPicPr>
                   <pic:blipFill>
-                    <a:blip r:embed="rId140"/>
+                    <a:blip r:embed="rId28"/>
                     <a:stretch>
                       <a:fillRect/>
                     </a:stretch>
@@ -9576,7 +9647,7 @@
                   <pic:spPr bwMode="auto">
                     <a:xfrm>
                       <a:off x="0" y="0"/>
-                      <a:ext cx="4279392" cy="6151258"/>
+                      <a:ext cx="3840480" cy="5520359"/>
                     </a:xfrm>
                     <a:prstGeom prst="rect">
                       <a:avLst/>
@@ -9716,7 +9787,7 @@
         <w:t xml:space="preserve">.</w:t>
       </w:r>
     </w:p>
-    <w:bookmarkEnd w:id="143"/>
+    <w:bookmarkEnd w:id="31"/>
     <w:p>
       <w:pPr>
         <w:pStyle w:val="BodyText"/>
@@ -10077,8 +10148,8 @@
         <w:t xml:space="preserve">, while the universal and odd-cycle theorems are symbolic.</w:t>
       </w:r>
     </w:p>
-    <w:bookmarkEnd w:id="144"/>
-    <w:bookmarkStart w:id="145" w:name="discussion-and-limitations"/>
+    <w:bookmarkEnd w:id="32"/>
+    <w:bookmarkStart w:id="33" w:name="discussion-and-limitations"/>
     <w:p>
       <w:pPr>
         <w:pStyle w:val="Heading1"/>
@@ -10092,7 +10163,7 @@
         <w:pStyle w:val="FirstParagraph"/>
       </w:pPr>
       <w:r>
-        <w:t xml:space="preserve">Starting from Rybin’s triangle counterexample, the universal construction shows that additive load inequalities can encode arbitrary finite independence systems, provided singleton selection remains feasible. This expressive power comes from three ingredients: a private zero-cost chain for each decision, an incidence resource for each participation in a minimal obstruction, and an auxiliary unit demand for each obstruction. The exit-dominator property makes the mechanism robust to path splicing.</w:t>
+        <w:t xml:space="preserve">The universal construction shows that additive load inequalities can encode arbitrary finite independence systems, provided singleton selection remains feasible. This expressive power comes from three ingredients: a private zero-cost chain for each decision, an incidence resource for each participation in a minimal obstruction, and an auxiliary unit demand for each obstruction. The exit-dominator property makes the mechanism robust to path splicing.</w:t>
       </w:r>
     </w:p>
     <w:p>
@@ -10145,8 +10216,8 @@
         <w:t xml:space="preserve">boundary. The family therefore supplies a structural generalisation and a scoped calculation rather than a stronger counterexample. The construction is short and the underlying conflict-encoding idea may be folklore; no claim of definitive novelty or flagship scope is made. Finally, the general proof has not been formalised in a proof assistant. The exact scripts machine-check the finite certificates and rational identities, while the universal theorem remains a conventional mathematical proof.</w:t>
       </w:r>
     </w:p>
-    <w:bookmarkEnd w:id="145"/>
-    <w:bookmarkStart w:id="146" w:name="conclusion"/>
+    <w:bookmarkEnd w:id="33"/>
+    <w:bookmarkStart w:id="34" w:name="conclusion"/>
     <w:p>
       <w:pPr>
         <w:pStyle w:val="Heading1"/>
@@ -10160,7 +10231,7 @@
         <w:pStyle w:val="FirstParagraph"/>
       </w:pPr>
       <w:r>
-        <w:t xml:space="preserve">Rybin’s triangle counterexample reveals that additive-congestion inequalities can enforce a stable-set obstruction. This note generalises that mechanism: every finite loopless independence system can be embedded into the cheap-choice structure of an acyclic single-source unsplittable-flow instance in a manner closed under all actual graph paths. Odd cycles turn the qualitative construction into a scoped cost-congestion calculation, and the</w:t>
+        <w:t xml:space="preserve">Additive-congestion inequalities can enforce a stable-set obstruction: every finite loopless independence system can be embedded into the cheap-choice structure of an acyclic single-source unsplittable-flow instance in a manner closed under all actual graph paths. Odd cycles turn the qualitative construction into a scoped cost-congestion calculation, and the</w:t>
       </w:r>
       <w:r>
         <w:t xml:space="preserve"> </w:t>
@@ -10194,8 +10265,8 @@
         <w:t xml:space="preserve">The construction suggests two natural directions. First, one may seek compressed gadgets for structured forbidden systems. Second, one may investigate which additional graph restrictions—planarity, bounded genus, bounded treewidth, or series-parallel structure—limit the independence systems that can be realised and thereby constrain cost-congestion lower bounds.</w:t>
       </w:r>
     </w:p>
-    <w:bookmarkEnd w:id="146"/>
-    <w:bookmarkStart w:id="147" w:name="reproducibility-protocol"/>
+    <w:bookmarkEnd w:id="34"/>
+    <w:bookmarkStart w:id="54" w:name="reproducibility-protocol"/>
     <w:p>
       <w:pPr>
         <w:pStyle w:val="Heading1"/>
@@ -10295,18 +10366,8 @@
         <w:t xml:space="preserve">, and runs adversarial mutation tests. It requires no third-party Python package.</w:t>
       </w:r>
     </w:p>
-    <w:bookmarkEnd w:id="147"/>
-    <w:bookmarkStart w:id="167" w:name="bibliography"/>
-    <w:p>
-      <w:pPr>
-        <w:pStyle w:val="Heading1"/>
-      </w:pPr>
-      <w:r>
-        <w:t xml:space="preserve">References</w:t>
-      </w:r>
-    </w:p>
-    <w:bookmarkStart w:id="166" w:name="refs"/>
-    <w:bookmarkStart w:id="149" w:name="ref-dgg1999"/>
+    <w:bookmarkStart w:id="53" w:name="refs"/>
+    <w:bookmarkStart w:id="36" w:name="ref-dgg1999"/>
     <w:p>
       <w:pPr>
         <w:pStyle w:val="Bibliography"/>
@@ -10339,7 +10400,7 @@
       <w:r>
         <w:t xml:space="preserve"> </w:t>
       </w:r>
-      <w:hyperlink r:id="rId148">
+      <w:hyperlink r:id="rId35">
         <w:r>
           <w:rPr>
             <w:rStyle w:val="Hyperlink"/>
@@ -10351,8 +10412,8 @@
         <w:t xml:space="preserve">.</w:t>
       </w:r>
     </w:p>
-    <w:bookmarkEnd w:id="149"/>
-    <w:bookmarkStart w:id="151" w:name="ref-golumbic1985"/>
+    <w:bookmarkEnd w:id="36"/>
+    <w:bookmarkStart w:id="38" w:name="ref-golumbic1985"/>
     <w:p>
       <w:pPr>
         <w:pStyle w:val="Bibliography"/>
@@ -10385,7 +10446,7 @@
       <w:r>
         <w:t xml:space="preserve"> </w:t>
       </w:r>
-      <w:hyperlink r:id="rId150">
+      <w:hyperlink r:id="rId37">
         <w:r>
           <w:rPr>
             <w:rStyle w:val="Hyperlink"/>
@@ -10397,14 +10458,20 @@
         <w:t xml:space="preserve">.</w:t>
       </w:r>
     </w:p>
-    <w:bookmarkEnd w:id="151"/>
-    <w:bookmarkStart w:id="153" w:name="ref-almoghrabi2024"/>
+    <w:bookmarkEnd w:id="38"/>
+    <w:bookmarkStart w:id="40" w:name="ref-almoghrabi2025"/>
     <w:p>
       <w:pPr>
         <w:pStyle w:val="Bibliography"/>
       </w:pPr>
       <w:r>
-        <w:t xml:space="preserve">Majthoub Almoghrabi, Mohammad, Martin Skutella, and Philipp Warode. 2024.</w:t>
+        <w:t xml:space="preserve">Majthoub Almoghrabi, Mohammed, Martin Skutella, and Philipp Warode. 2025.</w:t>
+      </w:r>
+      <w:r>
+        <w:t xml:space="preserve"> </w:t>
+      </w:r>
+      <w:r>
+        <w:t xml:space="preserve">“Integer and Unsplittable Multiflows in Series-Parallel Digraphs.”</w:t>
       </w:r>
       <w:r>
         <w:t xml:space="preserve"> </w:t>
@@ -10414,34 +10481,34 @@
           <w:i/>
           <w:iCs/>
         </w:rPr>
-        <w:t xml:space="preserve">Integer and Unsplittable Multiflows in Series-Parallel Digraphs</w:t>
-      </w:r>
-      <w:r>
-        <w:t xml:space="preserve">.</w:t>
-      </w:r>
-      <w:r>
-        <w:t xml:space="preserve"> </w:t>
-      </w:r>
-      <w:hyperlink r:id="rId152">
+        <w:t xml:space="preserve">Integer Programming and Combinatorial Optimization</w:t>
+      </w:r>
+      <w:r>
+        <w:t xml:space="preserve">, Lecture notes in computer science, vol. 15620: 427–41.</w:t>
+      </w:r>
+      <w:r>
+        <w:t xml:space="preserve"> </w:t>
+      </w:r>
+      <w:hyperlink r:id="rId39">
         <w:r>
           <w:rPr>
             <w:rStyle w:val="Hyperlink"/>
           </w:rPr>
-          <w:t xml:space="preserve">https://arxiv.org/abs/2412.05182</w:t>
+          <w:t xml:space="preserve">https://doi.org/10.1007/978-3-031-93112-3_31</w:t>
         </w:r>
       </w:hyperlink>
       <w:r>
         <w:t xml:space="preserve">.</w:t>
       </w:r>
     </w:p>
-    <w:bookmarkEnd w:id="153"/>
-    <w:bookmarkStart w:id="155" w:name="ref-morell2022"/>
+    <w:bookmarkEnd w:id="40"/>
+    <w:bookmarkStart w:id="42" w:name="ref-morell2022"/>
     <w:p>
       <w:pPr>
         <w:pStyle w:val="Bibliography"/>
       </w:pPr>
       <w:r>
-        <w:t xml:space="preserve">Morell, Samuel, and Martin Skutella. 2022.</w:t>
+        <w:t xml:space="preserve">Morell, Sarah, and Martin Skutella. 2022.</w:t>
       </w:r>
       <w:r>
         <w:t xml:space="preserve"> </w:t>
@@ -10463,12 +10530,12 @@
         <w:t xml:space="preserve"> </w:t>
       </w:r>
       <w:r>
-        <w:t xml:space="preserve">192: 697–720.</w:t>
-      </w:r>
-      <w:r>
-        <w:t xml:space="preserve"> </w:t>
-      </w:r>
-      <w:hyperlink r:id="rId154">
+        <w:t xml:space="preserve">192 (1): 477–96.</w:t>
+      </w:r>
+      <w:r>
+        <w:t xml:space="preserve"> </w:t>
+      </w:r>
+      <w:hyperlink r:id="rId41">
         <w:r>
           <w:rPr>
             <w:rStyle w:val="Hyperlink"/>
@@ -10480,8 +10547,8 @@
         <w:t xml:space="preserve">.</w:t>
       </w:r>
     </w:p>
-    <w:bookmarkEnd w:id="155"/>
-    <w:bookmarkStart w:id="157" w:name="ref-rybintranscript2026"/>
+    <w:bookmarkEnd w:id="42"/>
+    <w:bookmarkStart w:id="44" w:name="ref-rybintranscript2026"/>
     <w:p>
       <w:pPr>
         <w:pStyle w:val="Bibliography"/>
@@ -10505,7 +10572,7 @@
       <w:r>
         <w:t xml:space="preserve"> </w:t>
       </w:r>
-      <w:hyperlink r:id="rId156">
+      <w:hyperlink r:id="rId43">
         <w:r>
           <w:rPr>
             <w:rStyle w:val="Hyperlink"/>
@@ -10517,8 +10584,8 @@
         <w:t xml:space="preserve">.</w:t>
       </w:r>
     </w:p>
-    <w:bookmarkEnd w:id="157"/>
-    <w:bookmarkStart w:id="159" w:name="ref-rybin2026"/>
+    <w:bookmarkEnd w:id="44"/>
+    <w:bookmarkStart w:id="46" w:name="ref-rybin2026"/>
     <w:p>
       <w:pPr>
         <w:pStyle w:val="Bibliography"/>
@@ -10542,7 +10609,7 @@
       <w:r>
         <w:t xml:space="preserve"> </w:t>
       </w:r>
-      <w:hyperlink r:id="rId158">
+      <w:hyperlink r:id="rId45">
         <w:r>
           <w:rPr>
             <w:rStyle w:val="Hyperlink"/>
@@ -10554,8 +10621,8 @@
         <w:t xml:space="preserve">.</w:t>
       </w:r>
     </w:p>
-    <w:bookmarkEnd w:id="159"/>
-    <w:bookmarkStart w:id="161" w:name="ref-suvak2021"/>
+    <w:bookmarkEnd w:id="46"/>
+    <w:bookmarkStart w:id="48" w:name="ref-suvak2021"/>
     <w:p>
       <w:pPr>
         <w:pStyle w:val="Bibliography"/>
@@ -10588,7 +10655,7 @@
       <w:r>
         <w:t xml:space="preserve"> </w:t>
       </w:r>
-      <w:hyperlink r:id="rId160">
+      <w:hyperlink r:id="rId47">
         <w:r>
           <w:rPr>
             <w:rStyle w:val="Hyperlink"/>
@@ -10600,8 +10667,8 @@
         <w:t xml:space="preserve">.</w:t>
       </w:r>
     </w:p>
-    <w:bookmarkEnd w:id="161"/>
-    <w:bookmarkStart w:id="163" w:name="ref-swamy2026"/>
+    <w:bookmarkEnd w:id="48"/>
+    <w:bookmarkStart w:id="50" w:name="ref-swamy2026"/>
     <w:p>
       <w:pPr>
         <w:pStyle w:val="Bibliography"/>
@@ -10631,7 +10698,7 @@
       <w:r>
         <w:t xml:space="preserve"> </w:t>
       </w:r>
-      <w:hyperlink r:id="rId162">
+      <w:hyperlink r:id="rId49">
         <w:r>
           <w:rPr>
             <w:rStyle w:val="Hyperlink"/>
@@ -10643,8 +10710,8 @@
         <w:t xml:space="preserve">.</w:t>
       </w:r>
     </w:p>
-    <w:bookmarkEnd w:id="163"/>
-    <w:bookmarkStart w:id="165" w:name="ref-traub2026"/>
+    <w:bookmarkEnd w:id="50"/>
+    <w:bookmarkStart w:id="52" w:name="ref-traub2026"/>
     <w:p>
       <w:pPr>
         <w:pStyle w:val="Bibliography"/>
@@ -10674,7 +10741,7 @@
       <w:r>
         <w:t xml:space="preserve"> </w:t>
       </w:r>
-      <w:hyperlink r:id="rId164">
+      <w:hyperlink r:id="rId51">
         <w:r>
           <w:rPr>
             <w:rStyle w:val="Hyperlink"/>
@@ -10686,16 +10753,13 @@
         <w:t xml:space="preserve">.</w:t>
       </w:r>
     </w:p>
-    <w:bookmarkEnd w:id="165"/>
-    <w:bookmarkEnd w:id="166"/>
-    <w:bookmarkEnd w:id="167"/>
+    <w:bookmarkEnd w:id="52"/>
+    <w:bookmarkEnd w:id="53"/>
+    <w:bookmarkEnd w:id="54"/>
     <w:sectPr>
-      <w:footerReference r:id="rId10" w:type="default"/>
       <w:footnotePr>
         <w:numRestart w:val="eachSect"/>
       </w:footnotePr>
-      <w:pgSz w:h="15840" w:w="12240"/>
-      <w:pgMar w:bottom="1440" w:footer="708" w:header="708" w:left="1440" w:right="1440" w:top="1440"/>
     </w:sectPr>
   </w:body>
 </w:document>
@@ -10703,28 +10767,6 @@
 
 <file path=word/comments.xml><?xml version="1.0" encoding="utf-8"?>
 <w:comments xmlns:w="http://schemas.openxmlformats.org/wordprocessingml/2006/main" xmlns:m="http://schemas.openxmlformats.org/officeDocument/2006/math" xmlns:r="http://schemas.openxmlformats.org/officeDocument/2006/relationships" xmlns:o="urn:schemas-microsoft-com:office:office" xmlns:v="urn:schemas-microsoft-com:vml" xmlns:w10="urn:schemas-microsoft-com:office:word" xmlns:a="http://schemas.openxmlformats.org/drawingml/2006/main" xmlns:pic="http://schemas.openxmlformats.org/drawingml/2006/picture" xmlns:wp="http://schemas.openxmlformats.org/drawingml/2006/wordprocessingDrawing"/>
-</file>
-
-<file path=word/footer1.xml><?xml version="1.0" encoding="utf-8"?>
-<w:ftr xmlns:m="http://schemas.openxmlformats.org/officeDocument/2006/math" xmlns:mc="http://schemas.openxmlformats.org/markup-compatibility/2006" xmlns:mo="http://schemas.microsoft.com/office/mac/office/2008/main" xmlns:mv="urn:schemas-microsoft-com:mac:vml" xmlns:o="urn:schemas-microsoft-com:office:office" xmlns:r="http://schemas.openxmlformats.org/officeDocument/2006/relationships" xmlns:v="urn:schemas-microsoft-com:vml" xmlns:w10="urn:schemas-microsoft-com:office:word" xmlns:w14="http://schemas.microsoft.com/office/word/2010/wordml" xmlns:w="http://schemas.openxmlformats.org/wordprocessingml/2006/main" xmlns:wne="http://schemas.microsoft.com/office/word/2006/wordml" xmlns:wp14="http://schemas.microsoft.com/office/word/2010/wordprocessingDrawing" xmlns:wp="http://schemas.openxmlformats.org/drawingml/2006/wordprocessingDrawing" xmlns:wpc="http://schemas.microsoft.com/office/word/2010/wordprocessingCanvas" xmlns:wpg="http://schemas.microsoft.com/office/word/2010/wordprocessingGroup" xmlns:wpi="http://schemas.microsoft.com/office/word/2010/wordprocessingInk" xmlns:wps="http://schemas.microsoft.com/office/word/2010/wordprocessingShape" mc:Ignorable="w14 wp14">
-  <w:p>
-    <w:pPr>
-      <w:jc w:val="center"/>
-    </w:pPr>
-    <w:r>
-      <w:rPr>
-        <w:rFonts w:ascii="Times New Roman" w:hAnsi="Times New Roman"/>
-        <w:color w:val="555555"/>
-        <w:sz w:val="18"/>
-      </w:rPr>
-      <w:fldChar w:fldCharType="begin"/>
-      <w:instrText xml:space="preserve"> PAGE </w:instrText>
-      <w:fldChar w:fldCharType="separate"/>
-      <w:t>1</w:t>
-      <w:fldChar w:fldCharType="end"/>
-    </w:r>
-  </w:p>
-</w:ftr>
 </file>
 
 <file path=word/footnotes.xml><?xml version="1.0" encoding="utf-8"?>
@@ -11105,15 +11147,6 @@
   <w:style w:default="1" w:styleId="Normal" w:type="paragraph">
     <w:name w:val="Normal"/>
     <w:qFormat/>
-    <w:pPr>
-      <w:spacing w:after="100" w:before="0" w:line="276" w:lineRule="auto"/>
-      <w:jc w:val="both"/>
-    </w:pPr>
-    <w:rPr>
-      <w:rFonts w:ascii="Times New Roman" w:hAnsi="Times New Roman"/>
-      <w:color w:val="181818"/>
-      <w:sz w:val="21"/>
-    </w:rPr>
   </w:style>
   <w:style w:styleId="BodyText" w:type="paragraph">
     <w:name w:val="Body Text"/>
@@ -11121,29 +11154,14 @@
     <w:link w:val="BodyTextChar"/>
     <w:qFormat/>
     <w:pPr>
-      <w:spacing w:after="100" w:before="0" w:line="276" w:lineRule="auto"/>
-      <w:jc w:val="both"/>
+      <w:spacing w:after="180" w:before="180"/>
     </w:pPr>
-    <w:rPr>
-      <w:rFonts w:ascii="Times New Roman" w:hAnsi="Times New Roman"/>
-      <w:color w:val="181818"/>
-      <w:sz w:val="21"/>
-    </w:rPr>
   </w:style>
   <w:style w:customStyle="1" w:styleId="FirstParagraph" w:type="paragraph">
     <w:name w:val="First Paragraph"/>
     <w:basedOn w:val="BodyText"/>
     <w:next w:val="BodyText"/>
     <w:qFormat/>
-    <w:pPr>
-      <w:spacing w:after="100" w:before="0" w:line="276" w:lineRule="auto"/>
-      <w:jc w:val="both"/>
-    </w:pPr>
-    <w:rPr>
-      <w:rFonts w:ascii="Times New Roman" w:hAnsi="Times New Roman"/>
-      <w:color w:val="181818"/>
-      <w:sz w:val="21"/>
-    </w:rPr>
   </w:style>
   <w:style w:customStyle="1" w:styleId="Compact" w:type="paragraph">
     <w:name w:val="Compact"/>
@@ -11162,16 +11180,13 @@
     <w:qFormat/>
     <w:rsid w:val="00A10FD9"/>
     <w:pPr>
-      <w:keepNext/>
-      <w:spacing w:after="160" w:before="0" w:line="240" w:lineRule="auto"/>
+      <w:spacing w:after="80" w:line="240" w:lineRule="auto"/>
       <w:contextualSpacing/>
       <w:jc w:val="center"/>
     </w:pPr>
     <w:rPr>
-      <w:rFonts w:ascii="Times New Roman" w:asciiTheme="majorHAnsi" w:cstheme="majorBidi" w:eastAsiaTheme="majorEastAsia" w:hAnsi="Times New Roman" w:hAnsiTheme="majorHAnsi"/>
-      <w:b/>
-      <w:color w:val="181818"/>
-      <w:sz w:val="40"/>
+      <w:rFonts w:asciiTheme="majorHAnsi" w:cstheme="majorBidi" w:eastAsiaTheme="majorEastAsia" w:hAnsiTheme="majorHAnsi"/>
+      <w:sz w:val="56"/>
       <w:szCs w:val="56"/>
     </w:rPr>
   </w:style>
@@ -11229,14 +11244,9 @@
     <w:pPr>
       <w:keepNext/>
       <w:keepLines/>
-      <w:spacing w:after="80" w:before="0" w:line="240" w:lineRule="auto"/>
-      <w:jc w:val="center"/>
     </w:pPr>
     <w:rPr>
-      <w:rFonts w:ascii="Times New Roman" w:hAnsi="Times New Roman"/>
-      <w:i w:val="0"/>
-      <w:color w:val="555555"/>
-      <w:sz w:val="21"/>
+      <w:sz w:val="24"/>
       <w:szCs w:val="24"/>
     </w:rPr>
   </w:style>
@@ -11248,14 +11258,9 @@
     <w:pPr>
       <w:keepNext/>
       <w:keepLines/>
-      <w:spacing w:after="80" w:before="0" w:line="240" w:lineRule="auto"/>
-      <w:jc w:val="center"/>
     </w:pPr>
     <w:rPr>
-      <w:rFonts w:ascii="Times New Roman" w:hAnsi="Times New Roman"/>
-      <w:i w:val="0"/>
-      <w:color w:val="555555"/>
-      <w:sz w:val="20"/>
+      <w:sz w:val="24"/>
       <w:szCs w:val="24"/>
     </w:rPr>
   </w:style>
@@ -11267,14 +11272,12 @@
     <w:pPr>
       <w:keepNext/>
       <w:keepLines/>
-      <w:spacing w:after="100" w:before="160" w:line="240" w:lineRule="auto"/>
+      <w:spacing w:after="0" w:before="300"/>
       <w:jc w:val="center"/>
     </w:pPr>
     <w:rPr>
-      <w:rFonts w:ascii="Times New Roman" w:hAnsi="Times New Roman"/>
       <w:b/>
-      <w:color w:val="181818"/>
-      <w:sz w:val="22"/>
+      <w:sz w:val="20"/>
       <w:szCs w:val="20"/>
     </w:rPr>
   </w:style>
@@ -11286,14 +11289,10 @@
     <w:pPr>
       <w:keepNext/>
       <w:keepLines/>
-      <w:spacing w:after="80" w:before="0" w:line="264" w:lineRule="auto"/>
-      <w:ind w:left="504" w:right="504"/>
-      <w:jc w:val="both"/>
+      <w:spacing w:after="300" w:before="100"/>
     </w:pPr>
     <w:rPr>
-      <w:rFonts w:ascii="Times New Roman" w:hAnsi="Times New Roman"/>
-      <w:color w:val="181818"/>
-      <w:sz w:val="19"/>
+      <w:sz w:val="20"/>
       <w:szCs w:val="20"/>
     </w:rPr>
   </w:style>
@@ -11320,15 +11319,13 @@
     <w:pPr>
       <w:keepNext/>
       <w:keepLines/>
-      <w:spacing w:after="100" w:before="280" w:line="240" w:lineRule="auto"/>
+      <w:spacing w:after="80" w:before="360"/>
       <w:outlineLvl w:val="0"/>
     </w:pPr>
     <w:rPr>
-      <w:rFonts w:ascii="Times New Roman" w:asciiTheme="majorHAnsi" w:cstheme="majorBidi" w:eastAsiaTheme="majorEastAsia" w:hAnsi="Times New Roman" w:hAnsiTheme="majorHAnsi"/>
-      <w:b/>
-      <w:i w:val="0"/>
-      <w:color w:val="181818"/>
-      <w:sz w:val="28"/>
+      <w:rFonts w:asciiTheme="majorHAnsi" w:cstheme="majorBidi" w:eastAsiaTheme="majorEastAsia" w:hAnsiTheme="majorHAnsi"/>
+      <w:color w:themeColor="accent1" w:themeShade="BF" w:val="0F4761"/>
+      <w:sz w:val="40"/>
       <w:szCs w:val="40"/>
     </w:rPr>
   </w:style>
@@ -11345,15 +11342,13 @@
     <w:pPr>
       <w:keepNext/>
       <w:keepLines/>
-      <w:spacing w:after="80" w:before="220" w:line="240" w:lineRule="auto"/>
+      <w:spacing w:after="80" w:before="160"/>
       <w:outlineLvl w:val="1"/>
     </w:pPr>
     <w:rPr>
-      <w:rFonts w:ascii="Times New Roman" w:asciiTheme="majorHAnsi" w:cstheme="majorBidi" w:eastAsiaTheme="majorEastAsia" w:hAnsi="Times New Roman" w:hAnsiTheme="majorHAnsi"/>
-      <w:b/>
-      <w:i w:val="0"/>
-      <w:color w:val="181818"/>
-      <w:sz w:val="23"/>
+      <w:rFonts w:asciiTheme="majorHAnsi" w:cstheme="majorBidi" w:eastAsiaTheme="majorEastAsia" w:hAnsiTheme="majorHAnsi"/>
+      <w:color w:themeColor="accent1" w:themeShade="BF" w:val="0F4761"/>
+      <w:sz w:val="32"/>
       <w:szCs w:val="32"/>
     </w:rPr>
   </w:style>
@@ -11370,15 +11365,13 @@
     <w:pPr>
       <w:keepNext/>
       <w:keepLines/>
-      <w:spacing w:after="60" w:before="160" w:line="240" w:lineRule="auto"/>
+      <w:spacing w:after="80" w:before="160"/>
       <w:outlineLvl w:val="2"/>
     </w:pPr>
     <w:rPr>
-      <w:rFonts w:ascii="Times New Roman" w:cstheme="majorBidi" w:eastAsiaTheme="majorEastAsia" w:hAnsi="Times New Roman"/>
-      <w:b/>
-      <w:i/>
-      <w:color w:val="181818"/>
-      <w:sz w:val="21"/>
+      <w:rFonts w:cstheme="majorBidi" w:eastAsiaTheme="majorEastAsia"/>
+      <w:color w:themeColor="accent1" w:themeShade="BF" w:val="0F4761"/>
+      <w:sz w:val="28"/>
       <w:szCs w:val="28"/>
     </w:rPr>
   </w:style>
@@ -11793,23 +11786,15 @@
       <w:color w:themeColor="accent1" w:themeShade="BF" w:val="365F91"/>
     </w:rPr>
   </w:style>
-  <w:style w:customStyle="1" w:styleId="SourceCode" w:type="paragraph">
+  <w:style w:type="paragraph" w:customStyle="1" w:styleId="SourceCode">
     <w:name w:val="Source Code"/>
     <w:basedOn w:val="Normal"/>
     <w:link w:val="VerbatimChar"/>
     <w:pPr>
       <w:wordWrap w:val="off"/>
-      <w:spacing w:after="120" w:before="80" w:line="240" w:lineRule="auto"/>
-      <w:ind w:left="504"/>
-      <w:jc w:val="left"/>
     </w:pPr>
-    <w:rPr>
-      <w:rFonts w:ascii="Courier New" w:hAnsi="Courier New"/>
-      <w:color w:val="181818"/>
-      <w:sz w:val="18"/>
-    </w:rPr>
   </w:style>
-  <w:style w:customStyle="1" w:styleId="KeywordTok" w:type="character">
+  <w:style w:type="character" w:customStyle="1" w:styleId="KeywordTok">
     <w:name w:val="KeywordTok"/>
     <w:basedOn w:val="VerbatimChar"/>
     <w:rPr>
@@ -11817,77 +11802,77 @@
       <w:color w:val="007020"/>
     </w:rPr>
   </w:style>
-  <w:style w:customStyle="1" w:styleId="DataTypeTok" w:type="character">
+  <w:style w:type="character" w:customStyle="1" w:styleId="DataTypeTok">
     <w:name w:val="DataTypeTok"/>
     <w:basedOn w:val="VerbatimChar"/>
     <w:rPr>
       <w:color w:val="902000"/>
     </w:rPr>
   </w:style>
-  <w:style w:customStyle="1" w:styleId="DecValTok" w:type="character">
+  <w:style w:type="character" w:customStyle="1" w:styleId="DecValTok">
     <w:name w:val="DecValTok"/>
     <w:basedOn w:val="VerbatimChar"/>
     <w:rPr>
       <w:color w:val="40a070"/>
     </w:rPr>
   </w:style>
-  <w:style w:customStyle="1" w:styleId="BaseNTok" w:type="character">
+  <w:style w:type="character" w:customStyle="1" w:styleId="BaseNTok">
     <w:name w:val="BaseNTok"/>
     <w:basedOn w:val="VerbatimChar"/>
     <w:rPr>
       <w:color w:val="40a070"/>
     </w:rPr>
   </w:style>
-  <w:style w:customStyle="1" w:styleId="FloatTok" w:type="character">
+  <w:style w:type="character" w:customStyle="1" w:styleId="FloatTok">
     <w:name w:val="FloatTok"/>
     <w:basedOn w:val="VerbatimChar"/>
     <w:rPr>
       <w:color w:val="40a070"/>
     </w:rPr>
   </w:style>
-  <w:style w:customStyle="1" w:styleId="ConstantTok" w:type="character">
+  <w:style w:type="character" w:customStyle="1" w:styleId="ConstantTok">
     <w:name w:val="ConstantTok"/>
     <w:basedOn w:val="VerbatimChar"/>
     <w:rPr>
       <w:color w:val="880000"/>
     </w:rPr>
   </w:style>
-  <w:style w:customStyle="1" w:styleId="CharTok" w:type="character">
+  <w:style w:type="character" w:customStyle="1" w:styleId="CharTok">
     <w:name w:val="CharTok"/>
     <w:basedOn w:val="VerbatimChar"/>
     <w:rPr>
       <w:color w:val="4070a0"/>
     </w:rPr>
   </w:style>
-  <w:style w:customStyle="1" w:styleId="SpecialCharTok" w:type="character">
+  <w:style w:type="character" w:customStyle="1" w:styleId="SpecialCharTok">
     <w:name w:val="SpecialCharTok"/>
     <w:basedOn w:val="VerbatimChar"/>
     <w:rPr>
       <w:color w:val="4070a0"/>
     </w:rPr>
   </w:style>
-  <w:style w:customStyle="1" w:styleId="StringTok" w:type="character">
+  <w:style w:type="character" w:customStyle="1" w:styleId="StringTok">
     <w:name w:val="StringTok"/>
     <w:basedOn w:val="VerbatimChar"/>
     <w:rPr>
       <w:color w:val="4070a0"/>
     </w:rPr>
   </w:style>
-  <w:style w:customStyle="1" w:styleId="VerbatimStringTok" w:type="character">
+  <w:style w:type="character" w:customStyle="1" w:styleId="VerbatimStringTok">
     <w:name w:val="VerbatimStringTok"/>
     <w:basedOn w:val="VerbatimChar"/>
     <w:rPr>
       <w:color w:val="4070a0"/>
     </w:rPr>
   </w:style>
-  <w:style w:customStyle="1" w:styleId="SpecialStringTok" w:type="character">
+  <w:style w:type="character" w:customStyle="1" w:styleId="SpecialStringTok">
     <w:name w:val="SpecialStringTok"/>
     <w:basedOn w:val="VerbatimChar"/>
     <w:rPr>
       <w:color w:val="bb6688"/>
     </w:rPr>
   </w:style>
-  <w:style w:customStyle="1" w:styleId="ImportTok" w:type="character">
+  <w:style w:type="character" w:customStyle="1" w:styleId="ImportTok">
     <w:name w:val="ImportTok"/>
     <w:basedOn w:val="VerbatimChar"/>
     <w:rPr>
@@ -11895,7 +11880,7 @@
       <w:color w:val="008000"/>
     </w:rPr>
   </w:style>
-  <w:style w:customStyle="1" w:styleId="CommentTok" w:type="character">
+  <w:style w:type="character" w:customStyle="1" w:styleId="CommentTok">
     <w:name w:val="CommentTok"/>
     <w:basedOn w:val="VerbatimChar"/>
     <w:rPr>
@@ -11903,7 +11888,7 @@
       <w:color w:val="60a0b0"/>
     </w:rPr>
   </w:style>
-  <w:style w:customStyle="1" w:styleId="DocumentationTok" w:type="character">
+  <w:style w:type="character" w:customStyle="1" w:styleId="DocumentationTok">
     <w:name w:val="DocumentationTok"/>
     <w:basedOn w:val="VerbatimChar"/>
     <w:rPr>
@@ -11911,7 +11896,7 @@
       <w:color w:val="ba2121"/>
     </w:rPr>
   </w:style>
-  <w:style w:customStyle="1" w:styleId="AnnotationTok" w:type="character">
+  <w:style w:type="character" w:customStyle="1" w:styleId="AnnotationTok">
     <w:name w:val="AnnotationTok"/>
     <w:basedOn w:val="VerbatimChar"/>
     <w:rPr>
@@ -11920,7 +11905,7 @@
       <w:color w:val="60a0b0"/>
     </w:rPr>
   </w:style>
-  <w:style w:customStyle="1" w:styleId="CommentVarTok" w:type="character">
+  <w:style w:type="character" w:customStyle="1" w:styleId="CommentVarTok">
     <w:name w:val="CommentVarTok"/>
     <w:basedOn w:val="VerbatimChar"/>
     <w:rPr>
@@ -11929,28 +11914,28 @@
       <w:color w:val="60a0b0"/>
     </w:rPr>
   </w:style>
-  <w:style w:customStyle="1" w:styleId="OtherTok" w:type="character">
+  <w:style w:type="character" w:customStyle="1" w:styleId="OtherTok">
     <w:name w:val="OtherTok"/>
     <w:basedOn w:val="VerbatimChar"/>
     <w:rPr>
       <w:color w:val="007020"/>
     </w:rPr>
   </w:style>
-  <w:style w:customStyle="1" w:styleId="FunctionTok" w:type="character">
+  <w:style w:type="character" w:customStyle="1" w:styleId="FunctionTok">
     <w:name w:val="FunctionTok"/>
     <w:basedOn w:val="VerbatimChar"/>
     <w:rPr>
       <w:color w:val="06287e"/>
     </w:rPr>
   </w:style>
-  <w:style w:customStyle="1" w:styleId="VariableTok" w:type="character">
+  <w:style w:type="character" w:customStyle="1" w:styleId="VariableTok">
     <w:name w:val="VariableTok"/>
     <w:basedOn w:val="VerbatimChar"/>
     <w:rPr>
       <w:color w:val="19177c"/>
     </w:rPr>
   </w:style>
-  <w:style w:customStyle="1" w:styleId="ControlFlowTok" w:type="character">
+  <w:style w:type="character" w:customStyle="1" w:styleId="ControlFlowTok">
     <w:name w:val="ControlFlowTok"/>
     <w:basedOn w:val="VerbatimChar"/>
     <w:rPr>
@@ -11958,45 +11943,45 @@
       <w:color w:val="007020"/>
     </w:rPr>
   </w:style>
-  <w:style w:customStyle="1" w:styleId="OperatorTok" w:type="character">
+  <w:style w:type="character" w:customStyle="1" w:styleId="OperatorTok">
     <w:name w:val="OperatorTok"/>
     <w:basedOn w:val="VerbatimChar"/>
     <w:rPr>
       <w:color w:val="666666"/>
     </w:rPr>
   </w:style>
-  <w:style w:customStyle="1" w:styleId="BuiltInTok" w:type="character">
+  <w:style w:type="character" w:customStyle="1" w:styleId="BuiltInTok">
     <w:name w:val="BuiltInTok"/>
     <w:basedOn w:val="VerbatimChar"/>
     <w:rPr>
       <w:color w:val="008000"/>
     </w:rPr>
   </w:style>
-  <w:style w:customStyle="1" w:styleId="ExtensionTok" w:type="character">
+  <w:style w:type="character" w:customStyle="1" w:styleId="ExtensionTok">
     <w:name w:val="ExtensionTok"/>
     <w:basedOn w:val="VerbatimChar"/>
     <w:rPr/>
   </w:style>
-  <w:style w:customStyle="1" w:styleId="PreprocessorTok" w:type="character">
+  <w:style w:type="character" w:customStyle="1" w:styleId="PreprocessorTok">
     <w:name w:val="PreprocessorTok"/>
     <w:basedOn w:val="VerbatimChar"/>
     <w:rPr>
       <w:color w:val="bc7a00"/>
     </w:rPr>
   </w:style>
-  <w:style w:customStyle="1" w:styleId="AttributeTok" w:type="character">
+  <w:style w:type="character" w:customStyle="1" w:styleId="AttributeTok">
     <w:name w:val="AttributeTok"/>
     <w:basedOn w:val="VerbatimChar"/>
     <w:rPr>
       <w:color w:val="7d9029"/>
     </w:rPr>
   </w:style>
-  <w:style w:customStyle="1" w:styleId="RegionMarkerTok" w:type="character">
+  <w:style w:type="character" w:customStyle="1" w:styleId="RegionMarkerTok">
     <w:name w:val="RegionMarkerTok"/>
     <w:basedOn w:val="VerbatimChar"/>
     <w:rPr/>
   </w:style>
-  <w:style w:customStyle="1" w:styleId="InformationTok" w:type="character">
+  <w:style w:type="character" w:customStyle="1" w:styleId="InformationTok">
     <w:name w:val="InformationTok"/>
     <w:basedOn w:val="VerbatimChar"/>
     <w:rPr>
@@ -12005,7 +11990,7 @@
       <w:color w:val="60a0b0"/>
     </w:rPr>
   </w:style>
-  <w:style w:customStyle="1" w:styleId="WarningTok" w:type="character">
+  <w:style w:type="character" w:customStyle="1" w:styleId="WarningTok">
     <w:name w:val="WarningTok"/>
     <w:basedOn w:val="VerbatimChar"/>
     <w:rPr>
@@ -12014,7 +11999,7 @@
       <w:color w:val="60a0b0"/>
     </w:rPr>
   </w:style>
-  <w:style w:customStyle="1" w:styleId="AlertTok" w:type="character">
+  <w:style w:type="character" w:customStyle="1" w:styleId="AlertTok">
     <w:name w:val="AlertTok"/>
     <w:basedOn w:val="VerbatimChar"/>
     <w:rPr>
@@ -12022,7 +12007,7 @@
       <w:color w:val="ff0000"/>
     </w:rPr>
   </w:style>
-  <w:style w:customStyle="1" w:styleId="ErrorTok" w:type="character">
+  <w:style w:type="character" w:customStyle="1" w:styleId="ErrorTok">
     <w:name w:val="ErrorTok"/>
     <w:basedOn w:val="VerbatimChar"/>
     <w:rPr>
@@ -12030,7 +12015,7 @@
       <w:color w:val="ff0000"/>
     </w:rPr>
   </w:style>
-  <w:style w:customStyle="1" w:styleId="NormalTok" w:type="character">
+  <w:style w:type="character" w:customStyle="1" w:styleId="NormalTok">
     <w:name w:val="NormalTok"/>
     <w:basedOn w:val="VerbatimChar"/>
     <w:rPr/>

</xml_diff>